<commit_message>
vault backup: 2026-06-06 19:18:24
</commit_message>
<xml_diff>
--- a/05_Outputs/note/20260606_github-history/article.docx
+++ b/05_Outputs/note/20260606_github-history/article.docx
@@ -26,19 +26,97 @@
     <w:p/>
     <w:p>
       <w:r>
-        <w:t>「GitHubってよく聞くけど、結局なんなの？」</w:t>
+        <w:t>AIのツールを使いこなそうとして、ターミナルを開いた。</w:t>
       </w:r>
     </w:p>
     <w:p/>
     <w:p>
       <w:r>
-        <w:t>ITの話題に出てくるたびに、なんとなくスルーしてきた人も多いんじゃないかと思う。</w:t>
+        <w:t>コマンドを打ったら「SSH鍵がありません」というエラーが出た。SSH鍵って何？GitHubって何？リポジトリって何？</w:t>
       </w:r>
     </w:p>
     <w:p/>
     <w:p>
       <w:r>
-        <w:t>これは、2人のエンジニアが週末に始めた雑談が、18年後に世界中の開発者が使うインフラになるまでの話です。コードを知らなくても読める、GitHubの歴史をざっくり解説します。</w:t>
+        <w:t>Claudeに言われるまま操作して何とかなったけど、「自分は今何をやったんだ？」という状態が続いた。</w:t>
+      </w:r>
+    </w:p>
+    <w:p/>
+    <w:p>
+      <w:r>
+        <w:rPr>
+          <w:b/>
+        </w:rPr>
+        <w:t>忙しい人向けに先に結論を言います。</w:t>
+      </w:r>
+    </w:p>
+    <w:p/>
+    <w:p>
+      <w:pPr>
+        <w:pStyle w:val="ListBullet"/>
+      </w:pPr>
+      <w:r>
+        <w:rPr>
+          <w:b/>
+        </w:rPr>
+        <w:t>GitHubとは</w:t>
+      </w:r>
+      <w:r>
+        <w:t>：世界中のプログラマーがコードを保存・共有する場所。いわば「開発者たちの巨大なSNS」的な存在。</w:t>
+      </w:r>
+    </w:p>
+    <w:p>
+      <w:pPr>
+        <w:pStyle w:val="ListBullet"/>
+      </w:pPr>
+      <w:r>
+        <w:rPr>
+          <w:b/>
+        </w:rPr>
+        <w:t>リポジトリとは</w:t>
+      </w:r>
+      <w:r>
+        <w:t>：GitHubの中にある「コードの保存場所（フォルダ）」。スキルも誰かのリポジトリで公開されている。</w:t>
+      </w:r>
+    </w:p>
+    <w:p>
+      <w:pPr>
+        <w:pStyle w:val="ListBullet"/>
+      </w:pPr>
+      <w:r>
+        <w:rPr>
+          <w:b/>
+        </w:rPr>
+        <w:t>SSH鍵とは</w:t>
+      </w:r>
+      <w:r>
+        <w:t>：GitHubに「自分のパソコンを認証させる鍵」。これがないとコードの取得・送信ができない。</w:t>
+      </w:r>
+    </w:p>
+    <w:p>
+      <w:pPr>
+        <w:pStyle w:val="ListBullet"/>
+      </w:pPr>
+      <w:r>
+        <w:rPr>
+          <w:b/>
+        </w:rPr>
+        <w:t>Claudeスキルとは</w:t>
+      </w:r>
+      <w:r>
+        <w:t>：GitHubで誰かが無料公開しているAIへの指示書。リポジトリからダウンロードして使う。</w:t>
+      </w:r>
+    </w:p>
+    <w:p/>
+    <w:p>
+      <w:r>
+        <w:t>つまり「ClaudeスキルをGitHubから取ってくるには、SSH鍵でパソコンを認証する必要がある」というのが今回の話の全体像です。</w:t>
+      </w:r>
+    </w:p>
+    <w:p/>
+    <w:p>
+      <w:r>
+        <w:t>以下は、GitHubがどこから来てどう成長したかの歴史です。仕組みの背景を知りたい人はどうぞ。</w:t>
       </w:r>
     </w:p>
     <w:p/>
@@ -197,13 +275,13 @@
         <w:pStyle w:val="Heading3"/>
       </w:pPr>
       <w:r>
-        <w:t>2011年、リポジトリ100万件突破</w:t>
+        <w:t>2010〜2011年、リポジトリ100万件→200万件へ</w:t>
       </w:r>
     </w:p>
     <w:p/>
     <w:p>
       <w:r>
-        <w:t>サービス開始から3年で、ホストしているリポジトリ数が100万件を超えた。</w:t>
+        <w:t>サービス開始から2年でリポジトリ数が100万件を突破（2010年）。さらに1年後の2011年には200万件に倍増した。</w:t>
       </w:r>
     </w:p>
     <w:p/>
@@ -335,7 +413,7 @@
     <w:p/>
     <w:p>
       <w:r>
-        <w:t>現在、GitHubには1億人以上の開発者が登録しており、世界中のソフトウェアのかなりの割合がここで管理されている。</w:t>
+        <w:t>現在、GitHubには1億人を大きく超える開発者が登録しており、世界中のソフトウェアのかなりの割合がここで管理されている。</w:t>
       </w:r>
     </w:p>
     <w:p/>
@@ -414,10 +492,10 @@
         <w:rPr>
           <w:b/>
         </w:rPr>
-        <w:t>2011年</w:t>
+        <w:t>2010年</w:t>
       </w:r>
       <w:r>
-        <w:t>: リポジトリ100万件突破</w:t>
+        <w:t>: リポジトリ100万件突破、翌2011年に200万件</w:t>
       </w:r>
     </w:p>
     <w:p>
@@ -459,7 +537,7 @@
         <w:t>現在</w:t>
       </w:r>
       <w:r>
-        <w:t>: 1億人以上が使う世界最大のコード共有インフラ</w:t>
+        <w:t>: 1億人を大きく超える開発者が使う世界最大のコード共有インフラ</w:t>
       </w:r>
     </w:p>
     <w:p/>

</xml_diff>